<commit_message>
auto: XHS cards — 2026-07-26
</commit_message>
<xml_diff>
--- a/docs/xhs/2026-07-25/历史故事/发布文案.docx
+++ b/docs/xhs/2026-07-25/历史故事/发布文案.docx
@@ -75,7 +75,7 @@
         <w:rPr>
           <w:sz w:val="24"/>
         </w:rPr>
-        <w:t>#1  秦 · 兵马俑的“彩妆”去哪儿了？——秦兵马俑彩绘之谜  [历史趣考]</w:t>
+        <w:t>#1  战国/秦 · 秦始皇身世之谜：赵姬与吕不韦的千古疑案  [历史趣考]</w:t>
       </w:r>
     </w:p>
     <w:p>
@@ -83,7 +83,7 @@
         <w:spacing w:line="336" w:lineRule="auto"/>
       </w:pPr>
       <w:r>
-        <w:t>提起兵马俑，人们总想到灰扑扑的陶俑。但刚出土时，它们身着鲜艳彩绘：朱红、紫蓝、粉绿……然而接触空气后仅几分钟，颜料便脱水龟裂剥落，仅留下转瞬即逝的“真彩”。原来秦匠先在陶俑上涂生漆底，再施矿物颜料，埋藏两千年后，生漆层老化失水，遇干燥空气急速卷曲。如今借助现代技术，少数彩俑被完整保护，刷新了人们对秦代艺术粗犷的认知。</w:t>
+        <w:t>秦始皇的父亲究竟是秦庄襄王子楚还是大商人吕不韦？《史记》本纪明确记载嬴政是子楚的儿子，但《吕不韦列传》却暗示吕不韦将已怀孕的赵姬献给子楚，从而生下嬴政。两处矛盾引发千年争论。后世学者考证，《史记》常将同一事件在不同篇章中采用不同传闻，吕不韦献孕事可能来自六国遗民对秦朝的贬损之词。考古出土的秦简也无任何旁证。按妊娠期计算，若赵姬归子楚后足月生育，吕不韦之说不成立。但围绕这一宫闱秘史的考辨，却折射出太史公“互见法”的写作艺术以及汉代对秦政权的复杂态度。</w:t>
       </w:r>
     </w:p>
     <w:p>
@@ -91,7 +91,7 @@
         <w:spacing w:line="336" w:lineRule="auto"/>
       </w:pPr>
       <w:r>
-        <w:t>💡 眼见未必为实，历史真相往往藏在易逝的细节里。科技让湮灭的色彩重现，提醒我们对古代文明始终保持谦逊。</w:t>
+        <w:t>💡 读史需多方参证，同一事件不同记载间往往潜藏史家的褒贬与时代偏见。</w:t>
       </w:r>
     </w:p>
     <w:p/>
@@ -103,7 +103,7 @@
         <w:rPr>
           <w:sz w:val="24"/>
         </w:rPr>
-        <w:t>#2  西汉 · 汉代的“温室大棚”：皇帝冬天也能吃鲜葱  [历史趣考]</w:t>
+        <w:t>#2  西周/春秋 · 烽火戏诸侯？清华简还原真实的西周末年  [历史趣考]</w:t>
       </w:r>
     </w:p>
     <w:p>
@@ -111,7 +111,7 @@
         <w:spacing w:line="336" w:lineRule="auto"/>
       </w:pPr>
       <w:r>
-        <w:t>西汉宫廷竟有真实版的“温室大棚”。《汉书》记载，太官园冬天种植葱韭菜菇，建房屋覆盖，昼夜燃火保持室温，让蔬菜在严寒中生长。大臣召信臣认为此举违背天时、劳民伤财，上书劝停，皇帝只得罢止。这个皇家菜园堪称世界上最早的反季节人工温室，证明两千年前中国人已掌握温控种植技术，只是当时被视为奢侈浪费，未推广民间。</w:t>
+        <w:t>“烽火戏诸侯”是狼来了的王朝版：周幽王点燃烽火，只为博美人褒姒一笑，最终亡国。然而近年整理出版的清华简《系年》记载，幽王并未烽火戏诸侯，而是因主动废嫡立庶，引发太子宜臼（周平王）的外公申侯联合缯国与犬戎进攻，幽王战死。战国以降，对亡国之君往往叠加昏庸传说，烽火报警制度在秦汉才完善，西周尚无连绵报警的烽火台。此故事很可能是后世将战争烽燧附会到幽王身上，形成政治寓言。清华简《系年》的出现，为推翻这一千古冤案提供了关键证据。</w:t>
       </w:r>
     </w:p>
     <w:p>
@@ -119,7 +119,7 @@
         <w:spacing w:line="336" w:lineRule="auto"/>
       </w:pPr>
       <w:r>
-        <w:t>💡 技术超前于时代，还需要大众观念的接纳；节能减排与物尽其用，古人早已有深刻的反思。</w:t>
+        <w:t>💡 历史书写会被后人叠加伦理批判，出土文献能帮助我们剥离神话，接近事实本真。</w:t>
       </w:r>
     </w:p>
     <w:p/>
@@ -131,7 +131,7 @@
         <w:rPr>
           <w:sz w:val="24"/>
         </w:rPr>
-        <w:t>#3  战国 · 从“冰鉴”到“冰箱”：战国人的冷藏神器  [历史趣考]</w:t>
+        <w:t>#3  明 · 明代八股文：被误解的高难度文体  [历史趣考]</w:t>
       </w:r>
     </w:p>
     <w:p>
@@ -139,7 +139,7 @@
         <w:spacing w:line="336" w:lineRule="auto"/>
       </w:pPr>
       <w:r>
-        <w:t>1978年湖北随州曾侯乙墓出土一对青铜冰鉴，外形方方正正，内置酒壶，四周可填满冰块，达到冷藏效果。这是世界上最早的“冰箱”。《周礼》记载“凌人”掌管藏冰，冬天凿冰储藏，夏天供贵族使用。这套冰鉴利用青铜良好的保冷性和冰的融化吸热，为战国贵族奉上冰镇美酒，其设计之精巧令人惊叹，折射出当时高端生活的精致程度。</w:t>
+        <w:t>八股常被当作死板迂腐的代名词，实则它是古典文章中最难驾驭的格式之一。八股文要求“代圣贤立言”，破题、承题、起讲、提比、中比、后比、束比，结构严谨。顾炎武《日知录》说“八股者，文理之精微，委曲详尽，不可增减”，类似于戴着镣铐跳舞。在固定框架下，士子需展现经义功底、对仗技巧和逻辑思辨，优秀的八股文甚至可熔经铸史、气盛言宜。清代才子金圣叹、袁枚早年都以八股文显才。只是到晚清，八股命题日趋僵化，才彻底沦为创造性牢笼。</w:t>
       </w:r>
     </w:p>
     <w:p>
@@ -147,7 +147,7 @@
         <w:spacing w:line="336" w:lineRule="auto"/>
       </w:pPr>
       <w:r>
-        <w:t>💡 古代贵族的生活智慧与工艺水准远超想象，炎炎夏日的一杯冰酒，凝聚了自然利用与冶金技术的巧妙结合。</w:t>
+        <w:t>💡 评判历史事物需还原其时代语境，八股在初创时曾起到选拔真才的积极作用。</w:t>
       </w:r>
     </w:p>
     <w:p/>
@@ -159,7 +159,7 @@
         <w:rPr>
           <w:sz w:val="24"/>
         </w:rPr>
-        <w:t>#4  宋 · 宋代女子再嫁很丢人吗？范仲淹母亲就是改嫁的  [历史趣考]</w:t>
+        <w:t>#4  唐 · 唐代“以胖为美”是千古误会  [历史趣考]</w:t>
       </w:r>
     </w:p>
     <w:p>
@@ -167,7 +167,7 @@
         <w:spacing w:line="336" w:lineRule="auto"/>
       </w:pPr>
       <w:r>
-        <w:t>理学兴盛后，很多人以为宋代女子必须守节，实则不然。范仲淹幼年丧父，母亲谢氏改嫁朱氏，范仲淹随母生活并一度改名朱说，直到中进士后才认祖归宗。宋代法律并不禁止妇女再嫁，甚至保护其财产，南宋判例集《清明集》里有大量再嫁案例。直到元明，贞节观才逐渐极端化。范母的经历，正是宋代社会对改嫁相对宽容的生动写照。</w:t>
+        <w:t>不少人认为唐人“以胖为美”，因杨贵妃丰满。但从永泰公主墓壁画、各类唐俑和诗文看，唐代崇尚的并非肥胖，而是秾丽匀称、骨肉停匀的健康丰腴。杜甫《丽人行》写“肌理细腻骨肉匀”，李白咏“素手青条上，红妆白日鲜”，均侧重体态和谐。杨贵妃“微肌”并非痴肥，且《新唐书》评其“资质天挺”，丝毫无重量失度的记载。中晚唐审美逐渐转向纤柔，但丰满形象被后世夸大成“以肥为美”，实则盛唐更重气韵与自信。</w:t>
       </w:r>
     </w:p>
     <w:p>
@@ -175,7 +175,7 @@
         <w:spacing w:line="336" w:lineRule="auto"/>
       </w:pPr>
       <w:r>
-        <w:t>💡 历史观念是不断演变的，程朱理学在宋代并未一统天下，不应以明清的刻板标准去套回宋代。</w:t>
+        <w:t>💡 流行文化中的“唐肥胖”是一种简化投射，真实史实远比标签复杂。</w:t>
       </w:r>
     </w:p>
     <w:p/>
@@ -187,7 +187,7 @@
         <w:rPr>
           <w:sz w:val="24"/>
         </w:rPr>
-        <w:t>#5  明 · 大明神机营：世界最早的专业火器部队  [历史趣考]</w:t>
+        <w:t>#5  三国/魏 · 曹操疑冢七十二：被《三国演义》虚构的谎言  [历史趣考]</w:t>
       </w:r>
     </w:p>
     <w:p>
@@ -195,7 +195,7 @@
         <w:spacing w:line="336" w:lineRule="auto"/>
       </w:pPr>
       <w:r>
-        <w:t>提到明代军队，许多人先想到大刀长矛，其实明初已建立世界最早的全火器部队——神机营。永乐年间，朱棣远征安南获得神机枪炮法，遂设立神机营，装备管形火器，专门演练排枪射击、交替装填战术，比欧洲的火枪兵战术早了一百多年。神机营在京师守卫和征战中立下威名，可惜后来训练废弛，但它的存在证明中国一度走在火器革命的前列。</w:t>
+        <w:t>曹操临死吩咐“分香卖履”，并遗令“敛以时服，无藏金玉珍宝”。他选择了薄葬。然而宋代以后，“七十二疑冢”的说法不胫而走，说曹操在漳河一带设疑冢迷惑后人。其实，这源于《三国演义》的文学渲染以及民间盗墓心理。2009年河南安阳西高穴村发现曹操高陵——即魏武王墓，墓室简陋，陪葬品朴素，完全符合薄葬遗令。墓中出土的石牌刻有“魏武王常所用挌虎大戟”等器物，直接证实墓主身份。“七十二疑冢”纯属后世演绎。</w:t>
       </w:r>
     </w:p>
     <w:p>
@@ -203,7 +203,7 @@
         <w:spacing w:line="336" w:lineRule="auto"/>
       </w:pPr>
       <w:r>
-        <w:t>💡 技术领先不等于永远领先，制度僵化和保守会让优势丧失，创新需要持续投入和保持警惕。</w:t>
+        <w:t>💡 文学创作与历史真相需区分，考古发现往往能击破千年讹传。</w:t>
       </w:r>
     </w:p>
     <w:p/>
@@ -215,7 +215,7 @@
         <w:rPr>
           <w:sz w:val="24"/>
         </w:rPr>
-        <w:t>#6  魏晋 · 古人写错字怎么办？雌黄就是“涂改液”  [历史趣考]</w:t>
+        <w:t>#6  北宋/明 · 包拯铡陈世美：一场穿越时空的伪案  [历史趣考]</w:t>
       </w:r>
     </w:p>
     <w:p>
@@ -223,7 +223,7 @@
         <w:spacing w:line="336" w:lineRule="auto"/>
       </w:pPr>
       <w:r>
-        <w:t>现代人用修正液，古人用雌黄。雌黄是一种橙黄色矿物，魏晋纸张普及后，书吏抄书若写错字，就用雌黄涂抹覆盖，干后重写，与纸色相近，故成语“信口雌黄”本意是随意更改说法。沈括《梦溪笔谈》记得清楚：“馆阁新书净本有误书处，以雌黄涂之。”雌黄兼有抑菌防蛀作用，修改过的书籍还能有效防虫，可谓一举两得。</w:t>
+        <w:t>《铡美案》中，包拯怒铡忘恩负义的陈世美，大快人心。然而历史上陈世美实有其人，为明朝进士，官至贵州按察使，清廉正直，与北宋的包拯相隔五百多年，如何能同台受审？经考证，陈世美得罪了同乡文人，后者在戏曲中将其丑化为负心汉，并借包拯之名重塑公案。清代地方戏为吸引观众，将两个时代人物强行拼接，创造出这出经典桥段。真实的包拯执法严明，若遇上明代同僚，也只能徒呼奈何。</w:t>
       </w:r>
     </w:p>
     <w:p>
@@ -231,7 +231,7 @@
         <w:spacing w:line="336" w:lineRule="auto"/>
       </w:pPr>
       <w:r>
-        <w:t>💡 小工具折射大文化，“雌黄”不仅实用，还衍生出成语，提醒人们言语要像笔墨一样严谨。</w:t>
+        <w:t>💡 戏剧虽可借史抒怀，但不可将舞台情节当作信史，需分清艺术真实与史实。</w:t>
       </w:r>
     </w:p>
     <w:p/>
@@ -243,7 +243,7 @@
         <w:rPr>
           <w:sz w:val="24"/>
         </w:rPr>
-        <w:t>#7  汉晋 · 记里鼓车：古代带计程表的马车  [古代科技发明故事]</w:t>
+        <w:t>#7  东晋 · 书成换鹅：王羲之以字换鹅的潇洒  [古代名人逸事]</w:t>
       </w:r>
     </w:p>
     <w:p>
@@ -251,7 +251,7 @@
         <w:spacing w:line="336" w:lineRule="auto"/>
       </w:pPr>
       <w:r>
-        <w:t>汉代出现一种神奇的马车——记里鼓车。每行驶一里，车上木人自动击鼓一次；行十里，击镯一次。车内纯靠齿轮组传动，减速系统精密，堪称古代“里程表”。史书记载此车为天子仪仗所用，后世历代能工巧匠不断复原，南宋时还造出过实物。虽然没有张衡发明记里鼓车的直接证据，但东汉的科技氛围完全能支持此类发明，它展现了古人对机械自动化的追求。</w:t>
+        <w:t>山阴有一道士养了一群品相极佳的白鹅，王羲之特别喜欢，执意买下。道士早就想求王羲之抄写《道德经》，便笑着说：“若您能为我书写经文，我就将这群鹅全数奉送。”王羲之欣然应允，当即展纸挥毫，洋洋洒洒写完《黄庭经》（一说《道德经》），笼鹅而归，满心欢喜。此事被后人概括为“书成换白鹅”，体现王羲之性情真率，视所爱之物远胜金银。其书法如“飘若浮云，矫若惊龙”，据传颇得观鹅颈转腕之姿的启迪。</w:t>
       </w:r>
     </w:p>
     <w:p>
@@ -259,7 +259,7 @@
         <w:spacing w:line="336" w:lineRule="auto"/>
       </w:pPr>
       <w:r>
-        <w:t>💡 机械之美在于将复杂转化为直观，记里鼓车提醒我们，古代工匠的智慧远不止指南针。</w:t>
+        <w:t>💡 真情所寄，超越金钱价值，艺术也常在率性自然中臻于化境。</w:t>
       </w:r>
     </w:p>
     <w:p/>
@@ -271,7 +271,7 @@
         <w:rPr>
           <w:sz w:val="24"/>
         </w:rPr>
-        <w:t>#8  宋 · 水运仪象台：宋代的天文钟惊世之作  [古代科技发明故事]</w:t>
+        <w:t>#8  北宋 · 欧阳修“三上”作文：枕上、马上、厕上  [古代名人逸事]</w:t>
       </w:r>
     </w:p>
     <w:p>
@@ -279,7 +279,7 @@
         <w:spacing w:line="336" w:lineRule="auto"/>
       </w:pPr>
       <w:r>
-        <w:t>北宋元祐年间，苏颂主持建造了一座高约12米的天文钟——水运仪象台。它集观测天象、演示星象、报时于一体，利用水轮为动力，通过复杂的擒纵机构控制恒定运转，被科学家李约瑟认为是“欧洲中世纪天文钟的直接祖先”。台上浑象自动旋转，与真实天象同步，阁内木偶按时出没报时。这般精密的机械杰作，比欧洲同类装置早了几百年。</w:t>
+        <w:t>欧阳修晚年辞官闲居，自号六一居士，曾对谢希深说：“我平生所做文章，多在‘三上’构思完成——乃马上、枕上、厕上也。”他认为，只有这些时刻能专心致志，便充分利用零碎时间构思文章。纵使公务繁忙，他也会在马背颠簸中推敲字句，卧床睡前默诵文脉，甚至如厕时也不忘斟酌诗篇。《醉翁亭记》等名篇正是这样经反复打磨而成。欧阳修的勤奋让后辈文士叹服：天才尚需争分夺秒，何况常人。</w:t>
       </w:r>
     </w:p>
     <w:p>
@@ -287,7 +287,7 @@
         <w:spacing w:line="336" w:lineRule="auto"/>
       </w:pPr>
       <w:r>
-        <w:t>💡 水运仪象台证明中国古代不仅有四大发明，在精密机械和天文仪器方面也一度领跑世界。</w:t>
+        <w:t>💡 利用碎片时间进行深度思考，是成事者不可或缺的习惯。</w:t>
       </w:r>
     </w:p>
     <w:p/>
@@ -299,7 +299,7 @@
         <w:rPr>
           <w:sz w:val="24"/>
         </w:rPr>
-        <w:t>#9  唐 · 敦煌《金刚经》：世界上现存最早的印刷书籍  [古代科技发明故事]</w:t>
+        <w:t>#9  三国/魏 · 马钧复原指南车：三国最被低估的发明家  [古代科技发明故事]</w:t>
       </w:r>
     </w:p>
     <w:p>
@@ -307,7 +307,7 @@
         <w:spacing w:line="336" w:lineRule="auto"/>
       </w:pPr>
       <w:r>
-        <w:t>1900年敦煌莫高窟藏经洞发现一卷《金刚般若波罗蜜经》，卷末题记“咸通九年四月十五日王玠为二亲敬造普施”。这是公元868年的雕版印刷品，也是世界现存最早有确切纪年的印本书籍。图案精美，文字清晰，说明当时的印刷术已非常成熟。可惜此宝卷被斯坦因带往英国，现藏大英图书馆。它用无言的力量证明，中国人率先将雕版印刷用于知识传播。</w:t>
+        <w:t>指南车传说始于黄帝，但汉代以后失传。曹魏时期，常侍高堂隆和骁骑将军秦朗在朝堂上争论古代是否有指南车，马钧表示可以复原出来。二人讥笑他虚言，马钧说：“虚争空言，不如试之。”魏明帝令其试做，马钧利用差速齿轮原理，成功制造出“车上立一木人，无论车行何方，木人手恒南指”的指南车，满朝无不佩服。马钧还改进了织绫机、发明了龙骨水车和轮转式发石车，堪称机械天才，却因口吃不善辩论而常被轻视。</w:t>
       </w:r>
     </w:p>
     <w:p>
@@ -315,7 +315,7 @@
         <w:spacing w:line="336" w:lineRule="auto"/>
       </w:pPr>
       <w:r>
-        <w:t>💡 每一件流失海外的文物，都是文明辉煌与伤痛的双重见证，提醒我辈自强不息。</w:t>
+        <w:t>💡 实干胜于空谈，技术成果才是最有说服力的辩词。</w:t>
       </w:r>
     </w:p>
     <w:p/>
@@ -327,7 +327,7 @@
         <w:rPr>
           <w:sz w:val="24"/>
         </w:rPr>
-        <w:t>#10  南北朝 · 算筹与祖冲之：不用算盘如何算出圆周率  [古代科技发明故事]</w:t>
+        <w:t>#10  北宋 · 苏颂与水运仪象台：千年之前的天文钟  [古代科技发明故事]</w:t>
       </w:r>
     </w:p>
     <w:p>
@@ -335,7 +335,7 @@
         <w:spacing w:line="336" w:lineRule="auto"/>
       </w:pPr>
       <w:r>
-        <w:t>算盘普及前，中国人用一把小棍——算筹，进行复杂运算。祖冲之正是运用这种古老工具，与儿子祖暅将圆周率精确到小数点后七位，领先世界近千年。算筹按十进制纵横排列，正负数用不同颜色区分，可进行开方等高等数学运算。祖冲之的成就，是无数根小棍堆积出的数学高峰，他展现了中国传统数学强大的算法智慧，而非仅仅经验总结。</w:t>
+        <w:t>北宋元祐年间，苏颂与吏部守当官韩公廉历时数年，建成高约12米的水运仪象台。它集观测、演示和报时于一体，顶部有浑仪，中层是浑象，底层为计时系统。利用水力推动齿轮组，恒速运转，每逢辰刻会有木人击钟鼓报时，精巧绝伦。苏颂对此制作了详细图纸《新仪象法要》，其中“擒纵器”原理被后世视为机械钟表的关键前身。李约瑟称其为“欧洲天文钟的直系祖先”。水运仪象台在靖康之变后毁于战乱，但其设计开创了自动化天文仪器新天地。</w:t>
       </w:r>
     </w:p>
     <w:p>
@@ -343,7 +343,7 @@
         <w:spacing w:line="336" w:lineRule="auto"/>
       </w:pPr>
       <w:r>
-        <w:t>💡 工具虽简，智慧无穷。算筹蕴含的十进位值制思想，才是中国古代数学的灵魂。</w:t>
+        <w:t>💡 中国古代科技不止四大发明，精密机械曾领先世界，后人当珍视这份遗产。</w:t>
       </w:r>
     </w:p>
     <w:p/>

</xml_diff>